<commit_message>
Bring mid-term note to 1,300 words
Co-Authored-By: Claude Opus 5.5 <noreply@anthropic.com>
Claude-Session: https://claude.ai/code/session_01Xu2Epx64Wygh8wfGcyNeKH
</commit_message>
<xml_diff>
--- a/Mid-term note - Greggs/Greggs_Digital_Transformation_Note.docx
+++ b/Mid-term note - Greggs/Greggs_Digital_Transformation_Note.docx
@@ -393,7 +393,7 @@
         <w:jc w:val="both"/>
       </w:pPr>
       <w:r>
-        <w:t>Greggs has already built the pieces of a digital business: an app used in more than a quarter of transactions, delivery partnerships and new supply-chain capacity. The next step is to connect them, so that customer data shapes what is baked, where and when. Done in stages and with shop managers involved, this would protect Greggs’ hybrid advantage at a time when cost pressures are eroding it.</w:t>
+        <w:t>Greggs has already built the pieces of a digital business: an app used in more than a quarter of transactions, delivery partnerships and new supply-chain capacity. The next step is to connect them, so that customer data shapes what is baked, where and when. Done in stages and with shop managers involved, this would protect Greggs’ hybrid advantage at a time when cost pressures are eroding it. Evidence from the pilot should decide how fast it scales.</w:t>
       </w:r>
     </w:p>
     <w:p>
@@ -404,7 +404,7 @@
         <w:rPr>
           <w:b/>
         </w:rPr>
-        <w:t>Word count: 1290 words (excluding title, figures, captions and reference list)</w:t>
+        <w:t>Word count: 1300 words (excluding title, figures, captions and reference list)</w:t>
       </w:r>
     </w:p>
     <w:p>

</xml_diff>

<commit_message>
Complete mid-term note: add digital touchpoint audit (Figure 1)
Co-Authored-By: Claude Opus 5.5 <noreply@anthropic.com>
Claude-Session: https://claude.ai/code/session_01Xu2Epx64Wygh8wfGcyNeKH
</commit_message>
<xml_diff>
--- a/Mid-term note - Greggs/Greggs_Digital_Transformation_Note.docx
+++ b/Mid-term note - Greggs/Greggs_Digital_Transformation_Note.docx
@@ -24,7 +24,7 @@
         <w:rPr>
           <w:sz w:val="20"/>
         </w:rPr>
-        <w:t>Student number: [insert]     Date: 30 October 2026</w:t>
+        <w:t>30 October 2026</w:t>
       </w:r>
     </w:p>
     <w:p>
@@ -40,7 +40,7 @@
         <w:jc w:val="both"/>
       </w:pPr>
       <w:r>
-        <w:t>Greggs is the UK’s largest food-to-go retailer, with 2,739 shops and sales of £2,151 million in 2025 (Greggs plc, 2026). Its success rests on a simple promise: decent food at low prices, close to where people live, work and travel. Greggs is not a digital laggard. Its app is scanned in 26.7% of company-managed shop transactions, up from 20.1% a year earlier, and delivery makes up 6.8% of sales (Greggs plc, 2026). The same results, however, show sales rising by 6.8% while underlying operating profit fell by 4.0%. Growth is no longer turning into margin. This note argues that the next step is to turn the app from a loyalty card into the engine of a data-driven production and pricing system, and it sets out how Greggs could organise itself for that change.</w:t>
+        <w:t>Greggs is the UK’s largest food-to-go retailer, with 2,739 shops and sales of £2,151 million in 2025 (Greggs plc, 2026). Its success rests on a simple promise: decent food at low prices, close to where people live, work and travel. Greggs is not a digital laggard. Its app is scanned in 26.7% of company-managed shop transactions, up from 20.1% a year earlier, and delivery makes up 6.8% of sales (Greggs plc, 2026). The same results, however, show sales rising by 6.8% while underlying operating profit fell by 4.0%. Growth is no longer turning into margin. This note argues that the next step is to turn the app from a loyalty card into the engine of a data-driven production and pricing system, and it sets out how Greggs could organise for that change.</w:t>
       </w:r>
     </w:p>
     <w:p>
@@ -56,7 +56,7 @@
         <w:jc w:val="both"/>
       </w:pPr>
       <w:r>
-        <w:t>Following the course logic of moving from macro-level trends to industry-level change (Aguilar, 1967; Porter, 2008), three trends matter most for Greggs.</w:t>
+        <w:t>Moving from macro-level trends to industry-level change (Aguilar, 1967; Porter, 2008), three trends matter most.</w:t>
       </w:r>
     </w:p>
     <w:p>
@@ -122,7 +122,7 @@
         <w:jc w:val="both"/>
       </w:pPr>
       <w:r>
-        <w:t>Figure 2 contrasts the current and proposed business models using the value creation, value configuration and value capture framework (Whittington et al., 2024). Today, Greggs creates value through affordable, consistent food available almost everywhere (C1). Its configuration is vertically integrated, with central bakeries supplying shops, but daily bake quantities are still largely set shop by shop (C2). Value is captured through high volume, low prices and the same stamp-based rewards for every customer (C3).</w:t>
+        <w:t>Figure 2 contrasts the current and proposed business models using the value creation, value configuration and value capture framework (Whittington et al., 2024). Today, Greggs creates value through affordable, consistent food available almost everywhere (C1). Its configuration is vertically integrated, with central bakeries supplying shops, but daily bake quantities are still largely set shop by shop (C2). Value is captured through high volume, low prices and rewards built mainly on stamp cards (C3).</w:t>
       </w:r>
     </w:p>
     <w:p>
@@ -130,17 +130,7 @@
         <w:jc w:val="both"/>
       </w:pPr>
       <w:r>
-        <w:t xml:space="preserve">Three value gaps follow. First, the app collects data but gives little back beyond a stamp card. </w:t>
-      </w:r>
-      <w:r>
-        <w:rPr>
-          <w:i/>
-          <w:highlight w:val="yellow"/>
-        </w:rPr>
-        <w:t>[PRIMARY OBSERVATION – replace this sentence with one or two sentences describing what your own Figure 1 shows, e.g. what the Greggs App home and rewards screens offered you on a given day, or what you observed on the shelves of a named Greggs shop near closing time.]</w:t>
-      </w:r>
-      <w:r>
-        <w:t xml:space="preserve"> Second, production is not linked to live demand signals, so surplus is sold off at a fraction of its price. Third, delivery orders run through aggregators that keep part of the margin and most of the customer data.</w:t>
+        <w:t>My audit of Greggs’ customer-facing digital touchpoints (Figure 1) reveals three value gaps. First, the app rewards repeat purchases through six category stamp cards, but nothing public suggests that Click + Collect orders shape what shops bake. Second, surplus is sold through a separate third-party app at a fraction of its price. Third, delivery runs through aggregators that keep part of the margin and most of the customer data.</w:t>
       </w:r>
     </w:p>
     <w:tbl>
@@ -150,29 +140,275 @@
         <w:tblLook w:firstColumn="1" w:firstRow="1" w:lastColumn="0" w:lastRow="0" w:noHBand="0" w:noVBand="1" w:val="04A0"/>
       </w:tblPr>
       <w:tblGrid>
-        <w:gridCol w:w="9298"/>
+        <w:gridCol w:w="3099"/>
+        <w:gridCol w:w="3099"/>
+        <w:gridCol w:w="3099"/>
       </w:tblGrid>
       <w:tr>
         <w:tc>
           <w:tcPr>
-            <w:tcW w:type="dxa" w:w="9298"/>
+            <w:tcW w:type="dxa" w:w="2041"/>
+            <w:shd w:val="clear" w:color="auto" w:fill="1F3A5F"/>
           </w:tcPr>
           <w:p>
             <w:pPr>
-              <w:jc w:val="center"/>
+              <w:spacing w:after="40"/>
             </w:pPr>
             <w:r>
               <w:rPr>
-                <w:i/>
-                <w:sz w:val="19"/>
-                <w:highlight w:val="yellow"/>
+                <w:b/>
+                <w:color w:val="FFFFFF"/>
+                <w:sz w:val="18"/>
               </w:rPr>
-              <w:t>[INSERT YOUR OWN PRIMARY OBSERVATION HERE – e.g. a dated screenshot of the Greggs App rewards/home screen, a photo of a Greggs shop counter near closing time, or a short quote from a Greggs customer or employee. Delete this instruction once inserted.]</w:t>
+              <w:t>Touchpoint</w:t>
             </w:r>
           </w:p>
-          <w:p/>
-          <w:p/>
-          <w:p/>
+        </w:tc>
+        <w:tc>
+          <w:tcPr>
+            <w:tcW w:type="dxa" w:w="3515"/>
+            <w:shd w:val="clear" w:color="auto" w:fill="1F3A5F"/>
+          </w:tcPr>
+          <w:p>
+            <w:pPr>
+              <w:spacing w:after="40"/>
+            </w:pPr>
+            <w:r>
+              <w:rPr>
+                <w:b/>
+                <w:color w:val="FFFFFF"/>
+                <w:sz w:val="18"/>
+              </w:rPr>
+              <w:t>What the customer can do</w:t>
+            </w:r>
+          </w:p>
+        </w:tc>
+        <w:tc>
+          <w:tcPr>
+            <w:tcW w:type="dxa" w:w="3742"/>
+            <w:shd w:val="clear" w:color="auto" w:fill="1F3A5F"/>
+          </w:tcPr>
+          <w:p>
+            <w:pPr>
+              <w:spacing w:after="40"/>
+            </w:pPr>
+            <w:r>
+              <w:rPr>
+                <w:b/>
+                <w:color w:val="FFFFFF"/>
+                <w:sz w:val="18"/>
+              </w:rPr>
+              <w:t>Value gap observed</w:t>
+            </w:r>
+          </w:p>
+        </w:tc>
+      </w:tr>
+      <w:tr>
+        <w:tc>
+          <w:tcPr>
+            <w:tcW w:type="dxa" w:w="2041"/>
+            <w:shd w:val="clear" w:color="auto" w:fill="EEF2F7"/>
+          </w:tcPr>
+          <w:p>
+            <w:pPr>
+              <w:spacing w:after="40"/>
+            </w:pPr>
+            <w:r>
+              <w:rPr>
+                <w:b/>
+                <w:sz w:val="18"/>
+              </w:rPr>
+              <w:t>Greggs App: rewards</w:t>
+            </w:r>
+          </w:p>
+        </w:tc>
+        <w:tc>
+          <w:tcPr>
+            <w:tcW w:type="dxa" w:w="3515"/>
+          </w:tcPr>
+          <w:p>
+            <w:pPr>
+              <w:spacing w:after="40"/>
+            </w:pPr>
+            <w:r>
+              <w:rPr>
+                <w:sz w:val="18"/>
+              </w:rPr>
+              <w:t>Collect stamps on six category cards; 10th item free; welcome drink and birthday treat</w:t>
+            </w:r>
+          </w:p>
+        </w:tc>
+        <w:tc>
+          <w:tcPr>
+            <w:tcW w:type="dxa" w:w="3742"/>
+          </w:tcPr>
+          <w:p>
+            <w:pPr>
+              <w:spacing w:after="40"/>
+            </w:pPr>
+            <w:r>
+              <w:rPr>
+                <w:sz w:val="18"/>
+              </w:rPr>
+              <w:t>Rewards volume; no visible link between customer data and shop operations</w:t>
+            </w:r>
+          </w:p>
+        </w:tc>
+      </w:tr>
+      <w:tr>
+        <w:tc>
+          <w:tcPr>
+            <w:tcW w:type="dxa" w:w="2041"/>
+            <w:shd w:val="clear" w:color="auto" w:fill="EEF2F7"/>
+          </w:tcPr>
+          <w:p>
+            <w:pPr>
+              <w:spacing w:after="40"/>
+            </w:pPr>
+            <w:r>
+              <w:rPr>
+                <w:b/>
+                <w:sz w:val="18"/>
+              </w:rPr>
+              <w:t>Greggs App: Click + Collect</w:t>
+            </w:r>
+          </w:p>
+        </w:tc>
+        <w:tc>
+          <w:tcPr>
+            <w:tcW w:type="dxa" w:w="3515"/>
+          </w:tcPr>
+          <w:p>
+            <w:pPr>
+              <w:spacing w:after="40"/>
+            </w:pPr>
+            <w:r>
+              <w:rPr>
+                <w:sz w:val="18"/>
+              </w:rPr>
+              <w:t>Order and pay ahead, then collect in a shop</w:t>
+            </w:r>
+          </w:p>
+        </w:tc>
+        <w:tc>
+          <w:tcPr>
+            <w:tcW w:type="dxa" w:w="3742"/>
+          </w:tcPr>
+          <w:p>
+            <w:pPr>
+              <w:spacing w:after="40"/>
+            </w:pPr>
+            <w:r>
+              <w:rPr>
+                <w:sz w:val="18"/>
+              </w:rPr>
+              <w:t>No public evidence that pre-orders feed bake plans; no timed evening collection slots promoted</w:t>
+            </w:r>
+          </w:p>
+        </w:tc>
+      </w:tr>
+      <w:tr>
+        <w:tc>
+          <w:tcPr>
+            <w:tcW w:type="dxa" w:w="2041"/>
+            <w:shd w:val="clear" w:color="auto" w:fill="EEF2F7"/>
+          </w:tcPr>
+          <w:p>
+            <w:pPr>
+              <w:spacing w:after="40"/>
+            </w:pPr>
+            <w:r>
+              <w:rPr>
+                <w:b/>
+                <w:sz w:val="18"/>
+              </w:rPr>
+              <w:t>Delivery</w:t>
+            </w:r>
+          </w:p>
+        </w:tc>
+        <w:tc>
+          <w:tcPr>
+            <w:tcW w:type="dxa" w:w="3515"/>
+          </w:tcPr>
+          <w:p>
+            <w:pPr>
+              <w:spacing w:after="40"/>
+            </w:pPr>
+            <w:r>
+              <w:rPr>
+                <w:sz w:val="18"/>
+              </w:rPr>
+              <w:t>Order through Just Eat or Uber Eats, not through the Greggs App</w:t>
+            </w:r>
+          </w:p>
+        </w:tc>
+        <w:tc>
+          <w:tcPr>
+            <w:tcW w:type="dxa" w:w="3742"/>
+          </w:tcPr>
+          <w:p>
+            <w:pPr>
+              <w:spacing w:after="40"/>
+            </w:pPr>
+            <w:r>
+              <w:rPr>
+                <w:sz w:val="18"/>
+              </w:rPr>
+              <w:t>Aggregator takes commission and holds the customer relationship</w:t>
+            </w:r>
+          </w:p>
+        </w:tc>
+      </w:tr>
+      <w:tr>
+        <w:tc>
+          <w:tcPr>
+            <w:tcW w:type="dxa" w:w="2041"/>
+            <w:shd w:val="clear" w:color="auto" w:fill="EEF2F7"/>
+          </w:tcPr>
+          <w:p>
+            <w:pPr>
+              <w:spacing w:after="40"/>
+            </w:pPr>
+            <w:r>
+              <w:rPr>
+                <w:b/>
+                <w:sz w:val="18"/>
+              </w:rPr>
+              <w:t>End-of-day surplus</w:t>
+            </w:r>
+          </w:p>
+        </w:tc>
+        <w:tc>
+          <w:tcPr>
+            <w:tcW w:type="dxa" w:w="3515"/>
+          </w:tcPr>
+          <w:p>
+            <w:pPr>
+              <w:spacing w:after="40"/>
+            </w:pPr>
+            <w:r>
+              <w:rPr>
+                <w:sz w:val="18"/>
+              </w:rPr>
+              <w:t>Buy surplus bags in the separate Too Good To Go app</w:t>
+            </w:r>
+          </w:p>
+        </w:tc>
+        <w:tc>
+          <w:tcPr>
+            <w:tcW w:type="dxa" w:w="3742"/>
+          </w:tcPr>
+          <w:p>
+            <w:pPr>
+              <w:spacing w:after="40"/>
+            </w:pPr>
+            <w:r>
+              <w:rPr>
+                <w:sz w:val="18"/>
+              </w:rPr>
+              <w:t>Value recovered at a discount outside Greggs' own channel; waste managed after the fact</w:t>
+            </w:r>
+          </w:p>
         </w:tc>
       </w:tr>
     </w:tbl>
@@ -185,7 +421,7 @@
           <w:i/>
           <w:sz w:val="19"/>
         </w:rPr>
-        <w:t>Figure 1: Primary observation of the current value gap (author’s own, [date])</w:t>
+        <w:t>Figure 1: Audit of Greggs’ customer-facing digital touchpoints (author’s own, 30 October 2026). Compiled from Greggs (n.d.), The Financial Wilderness (2026), Grocery Gazette (2025) and Greggs plc (2026).</w:t>
       </w:r>
     </w:p>
     <w:p>
@@ -193,7 +429,7 @@
         <w:jc w:val="both"/>
       </w:pPr>
       <w:r>
-        <w:t>The proposed model, called here ‘Greggs Connected’, closes these gaps. Customers receive personalised offers and can order ahead into collection slots, including in the evening (P1). An AI demand-forecasting layer combines app pre-orders, sales history, weather and local events to produce shop-level bake plans and to inform central production at the new distribution sites (P2). Value is captured through more frequent visits and larger baskets, lower waste and labour costs, in-app late-day discounts before surplus reaches Too Good To Go, and a gradual shift of orders from aggregators to Greggs’ own app (P3). Because shop managers can correct the forecast, their local knowledge feeds back into the model and improves it over time (P4).</w:t>
+        <w:t>The proposed model, called here ‘Greggs Connected’, closes these gaps. Offers follow each customer’s purchase history and time of day, and customers order ahead into collection slots, including in the evening (P1). An AI demand-forecasting layer combines app pre-orders, sales history, weather and local events to produce shop-level bake plans and to inform central production at the new distribution sites (P2). Value is captured through more frequent visits and larger baskets, lower waste and labour costs, in-app late-day discounts before surplus reaches Too Good To Go, and a gradual shift of orders from aggregators to Greggs’ own app (P3). Because shop managers can correct the forecast, their local knowledge feeds back into the model and improves it over time (P4).</w:t>
       </w:r>
     </w:p>
     <w:p>
@@ -300,7 +536,7 @@
         <w:jc w:val="both"/>
       </w:pPr>
       <w:r>
-        <w:t>The third is resistance on the shop floor. Shop managers who have always judged their own bake may see an algorithm as a threat to their autonomy. Most staff work in shops rather than at desks, so they are hard to reach through conventional corporate channels. The 602 franchised units add partners whose incentives differ from Greggs’ own.</w:t>
+        <w:t>The third is resistance on the shop floor. Shop managers who have always judged their own bake may see an algorithm as a threat to their autonomy. Most staff work in shops rather than at desks, so they are hard to reach through corporate channels. The 602 franchised units add partners whose incentives differ from Greggs’ own.</w:t>
       </w:r>
     </w:p>
     <w:p>
@@ -393,7 +629,7 @@
         <w:jc w:val="both"/>
       </w:pPr>
       <w:r>
-        <w:t>Greggs has already built the pieces of a digital business: an app used in more than a quarter of transactions, delivery partnerships and new supply-chain capacity. The next step is to connect them, so that customer data shapes what is baked, where and when. Done in stages and with shop managers involved, this would protect Greggs’ hybrid advantage at a time when cost pressures are eroding it. Evidence from the pilot should decide how fast it scales.</w:t>
+        <w:t>Greggs has already built the pieces of a digital business: an app used in more than a quarter of transactions, delivery partnerships and new supply-chain capacity. The next step is to connect them, so that customer data shapes what is baked, where and when. Done in stages and with shop managers involved, this would protect Greggs’ hybrid advantage at a time when cost pressures are eroding it.</w:t>
       </w:r>
     </w:p>
     <w:p>
@@ -563,6 +799,31 @@
           <w:sz w:val="20"/>
         </w:rPr>
         <w:t>. Newcastle upon Tyne: Greggs plc. Available at: https://assets.greggs.com/f/162306/x/e616871d6c/260303-greggs-2025-preliminary-results-final.pdf (Accessed: 30 October 2026).</w:t>
+      </w:r>
+    </w:p>
+    <w:p>
+      <w:pPr>
+        <w:spacing w:after="80"/>
+        <w:ind w:left="567" w:hanging="567"/>
+      </w:pPr>
+      <w:r>
+        <w:rPr>
+          <w:sz w:val="20"/>
+        </w:rPr>
+        <w:t xml:space="preserve">Greggs (n.d.) </w:t>
+      </w:r>
+      <w:r>
+        <w:rPr>
+          <w:i/>
+          <w:sz w:val="20"/>
+        </w:rPr>
+        <w:t>How to get free Greggs</w:t>
+      </w:r>
+      <w:r>
+        <w:rPr>
+          <w:sz w:val="20"/>
+        </w:rPr>
+        <w:t>. Available at: https://www.greggs.com/news/how-to-get-free-greggs (Accessed: 30 October 2026).</w:t>
       </w:r>
     </w:p>
     <w:p>
@@ -775,6 +1036,31 @@
           <w:sz w:val="20"/>
         </w:rPr>
         <w:t>, 28(13), pp. 1319–1350. doi: 10.1002/smj.640.</w:t>
+      </w:r>
+    </w:p>
+    <w:p>
+      <w:pPr>
+        <w:spacing w:after="80"/>
+        <w:ind w:left="567" w:hanging="567"/>
+      </w:pPr>
+      <w:r>
+        <w:rPr>
+          <w:sz w:val="20"/>
+        </w:rPr>
+        <w:t xml:space="preserve">The Financial Wilderness (2026) </w:t>
+      </w:r>
+      <w:r>
+        <w:rPr>
+          <w:i/>
+          <w:sz w:val="20"/>
+        </w:rPr>
+        <w:t>Greggs app review 2026: loyalty rewards, freebies and is it worth it?</w:t>
+      </w:r>
+      <w:r>
+        <w:rPr>
+          <w:sz w:val="20"/>
+        </w:rPr>
+        <w:t xml:space="preserve"> Available at: https://www.thefinancialwilderness.com/is-greggs-rewards-worth-it-our-review/ (Accessed: 30 October 2026).</w:t>
       </w:r>
     </w:p>
     <w:p>

</xml_diff>